<commit_message>
Restructure hero headline into two tiers; rename to Full-Stack Web Developer everywhere
</commit_message>
<xml_diff>
--- a/assets/cv/CV_Joni_Hermawan_English.docx
+++ b/assets/cv/CV_Joni_Hermawan_English.docx
@@ -65,7 +65,7 @@
                 <w:sz w:val="19"/>
                 <w:szCs w:val="19"/>
               </w:rPr>
-              <w:t>Full-Stack Developer</w:t>
+              <w:t>Full-Stack Web Developer</w:t>
             </w:r>
           </w:p>
           <w:p>
@@ -120,15 +120,15 @@
           <w:sz w:val="16"/>
           <w:szCs w:val="16"/>
         </w:rPr>
-        <w:t>Full-Stack Developer with a 7+ year foundation as a Senior IT System Engineer in enterprise-scale IT infrastructure. Building web applications with Next.js, React, and Golang, combining backend, database, and system security understanding — including hands-on experience managing a Hardware Security Module (HSM Payshield) and leading infrastructure migrations that improved server uptime by 15%. This combination gives me a well-rounded perspective for designing applications that are secure, scalable, and prod</w:t>
-      </w:r>
-      <w:r>
-        <w:rPr>
-          <w:color w:val="2B2B2B"/>
-          <w:sz w:val="16"/>
-          <w:szCs w:val="16"/>
-        </w:rPr>
-        <w:t>uction-ready.</w:t>
+        <w:t>Full-Stack Web Developer</w:t>
+      </w:r>
+      <w:r>
+        <w:rPr>
+          <w:color w:val="2B2B2B"/>
+          <w:sz w:val="16"/>
+          <w:szCs w:val="16"/>
+        </w:rPr>
+        <w:t xml:space="preserve"> with a 7+ year foundation as a Senior IT System Engineer in enterprise-scale IT infrastructure. Building web applications with Next.js, React, and Golang, combining backend, database, and system security understanding — including hands-on experience managing a Hardware Security Module (HSM Payshield) and leading infrastructure migrations that improved server uptime by 15%. This combination gives me a well-rounded perspective for designing applications that are secure, scalable, and production-ready.</w:t>
       </w:r>
     </w:p>
     <w:p>
@@ -342,15 +342,6 @@
           <w:szCs w:val="15"/>
         </w:rPr>
         <w:tab/>
-      </w:r>
-      <w:r>
-        <w:rPr>
-          <w:b/>
-          <w:bCs/>
-          <w:color w:val="3B6E71"/>
-          <w:sz w:val="15"/>
-          <w:szCs w:val="15"/>
-        </w:rPr>
         <w:t>2024 – Present</w:t>
       </w:r>
     </w:p>

</xml_diff>

<commit_message>
Update CV to Data Analyst positioning, add Analytics Dashboard project
Headline, summary, and skills reordered to lead with Data Analyst
(SQL, Excel, Power BI/Tableau, Statistics, Dashboarding, Python, Pandas)
to match the site's new positioning. Added the Analytics Dashboard
prototype project entry.
</commit_message>
<xml_diff>
--- a/assets/cv/CV_Joni_Hermawan_English.docx
+++ b/assets/cv/CV_Joni_Hermawan_English.docx
@@ -55,7 +55,13 @@
           </w:p>
           <w:p>
             <w:pPr>
-              <w:spacing w:before="20" w:after="60"/>
+              <w:rPr>
+                <w:b/>
+                <w:bCs/>
+                <w:color w:val="3B6E71"/>
+                <w:sz w:val="19"/>
+                <w:szCs w:val="19"/>
+              </w:rPr>
             </w:pPr>
             <w:r>
               <w:rPr>
@@ -65,7 +71,7 @@
                 <w:sz w:val="19"/>
                 <w:szCs w:val="19"/>
               </w:rPr>
-              <w:t>Full-Stack Web Developer</w:t>
+              <w:t>Data Analyst</w:t>
             </w:r>
           </w:p>
           <w:p>
@@ -112,174 +118,23 @@
     </w:p>
     <w:p>
       <w:pPr>
-        <w:spacing w:after="40"/>
-      </w:pPr>
-      <w:r>
-        <w:rPr>
-          <w:color w:val="2B2B2B"/>
-          <w:sz w:val="16"/>
-          <w:szCs w:val="16"/>
-        </w:rPr>
-        <w:t>Full-Stack Web Developer</w:t>
-      </w:r>
-      <w:r>
-        <w:rPr>
-          <w:color w:val="2B2B2B"/>
-          <w:sz w:val="16"/>
-          <w:szCs w:val="16"/>
-        </w:rPr>
-        <w:t xml:space="preserve"> with a 7+ year foundation as a Senior IT System Engineer in enterprise-scale IT infrastructure. Building web applications with Next.js, React, and Golang, combining backend, database, and system security understanding — including hands-on experience managing a Hardware Security Module (HSM Payshield) and leading infrastructure migrations that improved server uptime by 15%. This combination gives me a well-rounded perspective for designing applications that are secure, scalable, and production-ready.</w:t>
-      </w:r>
-    </w:p>
-    <w:p>
-      <w:pPr>
         <w:pBdr>
           <w:bottom w:val="single" w:sz="5" w:space="2" w:color="BFBFBF"/>
         </w:pBdr>
         <w:spacing w:before="140" w:after="60"/>
-      </w:pPr>
-      <w:r>
-        <w:rPr>
-          <w:b/>
-          <w:bCs/>
-          <w:color w:val="3B6E71"/>
-          <w:spacing w:val="16"/>
-          <w:sz w:val="18"/>
-          <w:szCs w:val="18"/>
-        </w:rPr>
-        <w:t>SELECTED PROJECTS</w:t>
-      </w:r>
-    </w:p>
-    <w:p>
-      <w:pPr>
-        <w:spacing w:after="40"/>
-      </w:pPr>
-      <w:r>
-        <w:rPr>
-          <w:b/>
-          <w:bCs/>
-          <w:color w:val="2B2B2B"/>
-          <w:sz w:val="16"/>
-          <w:szCs w:val="16"/>
-        </w:rPr>
-        <w:t xml:space="preserve">Nota POS  </w:t>
-      </w:r>
-      <w:r>
-        <w:rPr>
-          <w:i/>
-          <w:iCs/>
-          <w:color w:val="3B6E71"/>
-          <w:sz w:val="15"/>
-          <w:szCs w:val="15"/>
-        </w:rPr>
-        <w:t xml:space="preserve">(Next.js, Golang, SQL Server)  —  </w:t>
-      </w:r>
-      <w:r>
-        <w:rPr>
-          <w:color w:val="2B2B2B"/>
-          <w:sz w:val="16"/>
-          <w:szCs w:val="16"/>
-        </w:rPr>
-        <w:t>Multi-role point-of-sale system (Cashier, PPIC, Finance, Admin) with QRIS &amp; EDC payment integration and ESC/POS thermal receipt printing. (2023–present)</w:t>
-      </w:r>
-    </w:p>
-    <w:p>
-      <w:pPr>
-        <w:spacing w:after="40"/>
-      </w:pPr>
-      <w:r>
-        <w:rPr>
-          <w:b/>
-          <w:bCs/>
-          <w:color w:val="2B2B2B"/>
-          <w:sz w:val="16"/>
-          <w:szCs w:val="16"/>
-        </w:rPr>
-        <w:t xml:space="preserve">TDS – EDC SN Data Cleaner  </w:t>
-      </w:r>
-      <w:r>
-        <w:rPr>
-          <w:i/>
-          <w:iCs/>
-          <w:color w:val="3B6E71"/>
-          <w:sz w:val="15"/>
-          <w:szCs w:val="15"/>
-        </w:rPr>
-        <w:t xml:space="preserve">(Python, Pandas, JavaScript)  —  </w:t>
-      </w:r>
-      <w:r>
-        <w:rPr>
-          <w:color w:val="2B2B2B"/>
-          <w:sz w:val="16"/>
-          <w:szCs w:val="16"/>
-        </w:rPr>
-        <w:t>Data cleaning &amp; standardization tool for 60,000+ EDC Serial Number records, used daily by the operations team with no coding required. (2023)</w:t>
-      </w:r>
-    </w:p>
-    <w:p>
-      <w:pPr>
-        <w:spacing w:after="40"/>
-      </w:pPr>
-      <w:r>
-        <w:rPr>
-          <w:b/>
-          <w:bCs/>
-          <w:color w:val="2B2B2B"/>
-          <w:sz w:val="16"/>
-          <w:szCs w:val="16"/>
-        </w:rPr>
-        <w:t xml:space="preserve">Web Project Management Dashboard  </w:t>
-      </w:r>
-      <w:r>
-        <w:rPr>
-          <w:i/>
-          <w:iCs/>
-          <w:color w:val="3B6E71"/>
-          <w:sz w:val="15"/>
-          <w:szCs w:val="15"/>
-        </w:rPr>
-        <w:t xml:space="preserve">(Next.js, Golang, SQL Server)  —  </w:t>
-      </w:r>
-      <w:r>
-        <w:rPr>
-          <w:color w:val="2B2B2B"/>
-          <w:sz w:val="16"/>
-          <w:szCs w:val="16"/>
-        </w:rPr>
-        <w:t>Multi-module project management dashboard, including an architecture migration from Vite to the Next.js App Router for better performance. (2024)</w:t>
-      </w:r>
-    </w:p>
-    <w:p>
-      <w:pPr>
-        <w:spacing w:after="40"/>
-      </w:pPr>
-      <w:r>
-        <w:rPr>
-          <w:b/>
-          <w:bCs/>
-          <w:color w:val="2B2B2B"/>
-          <w:sz w:val="16"/>
-          <w:szCs w:val="16"/>
-        </w:rPr>
-        <w:t xml:space="preserve">daytodelist  </w:t>
-      </w:r>
-      <w:r>
-        <w:rPr>
-          <w:i/>
-          <w:iCs/>
-          <w:color w:val="3B6E71"/>
-          <w:sz w:val="15"/>
-          <w:szCs w:val="15"/>
-        </w:rPr>
-        <w:t xml:space="preserve">(Next.js 16, React 19, JWT Auth)  —  </w:t>
-      </w:r>
-      <w:r>
-        <w:rPr>
-          <w:color w:val="2B2B2B"/>
-          <w:sz w:val="16"/>
-          <w:szCs w:val="16"/>
-        </w:rPr>
-        <w:t>Task management app with user authentication and Excel report export, built to deepen my skills in server actions &amp; modern auth patterns. (2024–present)</w:t>
+        <w:rPr>
+          <w:color w:val="2B2B2B"/>
+          <w:sz w:val="16"/>
+          <w:szCs w:val="16"/>
+        </w:rPr>
+      </w:pPr>
+      <w:r>
+        <w:rPr>
+          <w:color w:val="2B2B2B"/>
+          <w:sz w:val="16"/>
+          <w:szCs w:val="16"/>
+        </w:rPr>
+        <w:t>Data Analyst with Frontend Development capabilities, backed by a 7+ year foundation as a Senior IT System Engineer in enterprise-scale IT infrastructure. Working with data using SQL, Excel, and Power BI/Tableau, and building the dashboards and interfaces myself with React &amp; Next.js — including hands-on experience managing a Hardware Security Module (HSM Payshield) and leading infrastructure migrations that improved server uptime by 15%. This combination gives me a well-rounded perspective for turning data into insights that are ready to act on.</w:t>
       </w:r>
     </w:p>
     <w:p>
@@ -298,6 +153,200 @@
           <w:sz w:val="18"/>
           <w:szCs w:val="18"/>
         </w:rPr>
+        <w:t>SELECTED PROJECTS</w:t>
+      </w:r>
+    </w:p>
+    <w:p>
+      <w:pPr>
+        <w:spacing w:after="40"/>
+        <w:rPr>
+          <w:b/>
+          <w:bCs/>
+          <w:color w:val="2B2B2B"/>
+          <w:sz w:val="16"/>
+          <w:szCs w:val="16"/>
+        </w:rPr>
+      </w:pPr>
+      <w:r>
+        <w:rPr>
+          <w:b/>
+          <w:bCs/>
+          <w:color w:val="2B2B2B"/>
+          <w:sz w:val="16"/>
+          <w:szCs w:val="16"/>
+        </w:rPr>
+        <w:t xml:space="preserve">Analytics Dashboard  </w:t>
+      </w:r>
+      <w:r>
+        <w:rPr>
+          <w:b/>
+          <w:bCs/>
+          <w:i/>
+          <w:color w:val="2B2B2B"/>
+          <w:sz w:val="16"/>
+          <w:szCs w:val="16"/>
+        </w:rPr>
+        <w:t>(JavaScript, SVG)</w:t>
+      </w:r>
+      <w:r>
+        <w:rPr>
+          <w:b/>
+          <w:bCs/>
+          <w:color w:val="2B2B2B"/>
+          <w:sz w:val="16"/>
+          <w:szCs w:val="16"/>
+        </w:rPr>
+        <w:t xml:space="preserve">  —  Prototype multi-branch analytics dashboard: KPIs, sales trends, target vs. actual, and an interactive Indonesia map with zoom/pan; built 100% with vanilla JavaScript/CSS/SVG. (2026)</w:t>
+      </w:r>
+    </w:p>
+    <w:p>
+      <w:pPr>
+        <w:spacing w:after="40"/>
+      </w:pPr>
+      <w:r>
+        <w:rPr>
+          <w:b/>
+          <w:bCs/>
+          <w:color w:val="2B2B2B"/>
+          <w:sz w:val="16"/>
+          <w:szCs w:val="16"/>
+        </w:rPr>
+        <w:t xml:space="preserve">Nota POS  </w:t>
+      </w:r>
+      <w:r>
+        <w:rPr>
+          <w:i/>
+          <w:iCs/>
+          <w:color w:val="3B6E71"/>
+          <w:sz w:val="15"/>
+          <w:szCs w:val="15"/>
+        </w:rPr>
+        <w:t xml:space="preserve">(Next.js, Golang, SQL Server)  —  </w:t>
+      </w:r>
+      <w:r>
+        <w:rPr>
+          <w:color w:val="2B2B2B"/>
+          <w:sz w:val="16"/>
+          <w:szCs w:val="16"/>
+        </w:rPr>
+        <w:t>Multi-role point-of-sale system (Cashier, PPIC, Finance, Admin) with QRIS &amp; EDC payment integration and ESC/POS thermal receipt printing. (2023–present)</w:t>
+      </w:r>
+    </w:p>
+    <w:p>
+      <w:pPr>
+        <w:spacing w:after="40"/>
+      </w:pPr>
+      <w:r>
+        <w:rPr>
+          <w:b/>
+          <w:bCs/>
+          <w:color w:val="2B2B2B"/>
+          <w:sz w:val="16"/>
+          <w:szCs w:val="16"/>
+        </w:rPr>
+        <w:t xml:space="preserve">TDS – EDC SN Data Cleaner  </w:t>
+      </w:r>
+      <w:r>
+        <w:rPr>
+          <w:i/>
+          <w:iCs/>
+          <w:color w:val="3B6E71"/>
+          <w:sz w:val="15"/>
+          <w:szCs w:val="15"/>
+        </w:rPr>
+        <w:t xml:space="preserve">(Python, Pandas, JavaScript)  —  </w:t>
+      </w:r>
+      <w:r>
+        <w:rPr>
+          <w:color w:val="2B2B2B"/>
+          <w:sz w:val="16"/>
+          <w:szCs w:val="16"/>
+        </w:rPr>
+        <w:t>Data cleaning &amp; standardization tool for 60,000+ EDC Serial Number records, used daily by the operations team with no coding required. (2023)</w:t>
+      </w:r>
+    </w:p>
+    <w:p>
+      <w:pPr>
+        <w:spacing w:after="40"/>
+      </w:pPr>
+      <w:r>
+        <w:rPr>
+          <w:b/>
+          <w:bCs/>
+          <w:color w:val="2B2B2B"/>
+          <w:sz w:val="16"/>
+          <w:szCs w:val="16"/>
+        </w:rPr>
+        <w:t xml:space="preserve">Web Project Management Dashboard  </w:t>
+      </w:r>
+      <w:r>
+        <w:rPr>
+          <w:i/>
+          <w:iCs/>
+          <w:color w:val="3B6E71"/>
+          <w:sz w:val="15"/>
+          <w:szCs w:val="15"/>
+        </w:rPr>
+        <w:t xml:space="preserve">(Next.js, Golang, SQL Server)  —  </w:t>
+      </w:r>
+      <w:r>
+        <w:rPr>
+          <w:color w:val="2B2B2B"/>
+          <w:sz w:val="16"/>
+          <w:szCs w:val="16"/>
+        </w:rPr>
+        <w:t>Multi-module project management dashboard, including an architecture migration from Vite to the Next.js App Router for better performance. (2024)</w:t>
+      </w:r>
+    </w:p>
+    <w:p>
+      <w:pPr>
+        <w:spacing w:after="40"/>
+      </w:pPr>
+      <w:r>
+        <w:rPr>
+          <w:b/>
+          <w:bCs/>
+          <w:color w:val="2B2B2B"/>
+          <w:sz w:val="16"/>
+          <w:szCs w:val="16"/>
+        </w:rPr>
+        <w:t xml:space="preserve">daytodelist  </w:t>
+      </w:r>
+      <w:r>
+        <w:rPr>
+          <w:i/>
+          <w:iCs/>
+          <w:color w:val="3B6E71"/>
+          <w:sz w:val="15"/>
+          <w:szCs w:val="15"/>
+        </w:rPr>
+        <w:t xml:space="preserve">(Next.js 16, React 19, JWT Auth)  —  </w:t>
+      </w:r>
+      <w:r>
+        <w:rPr>
+          <w:color w:val="2B2B2B"/>
+          <w:sz w:val="16"/>
+          <w:szCs w:val="16"/>
+        </w:rPr>
+        <w:t>Task management app with user authentication and Excel report export, built to deepen my skills in server actions &amp; modern auth patterns. (2024–present)</w:t>
+      </w:r>
+    </w:p>
+    <w:p>
+      <w:pPr>
+        <w:pBdr>
+          <w:bottom w:val="single" w:sz="5" w:space="2" w:color="BFBFBF"/>
+        </w:pBdr>
+        <w:spacing w:before="140" w:after="60"/>
+      </w:pPr>
+      <w:r>
+        <w:rPr>
+          <w:b/>
+          <w:bCs/>
+          <w:color w:val="3B6E71"/>
+          <w:spacing w:val="16"/>
+          <w:sz w:val="18"/>
+          <w:szCs w:val="18"/>
+        </w:rPr>
         <w:t>WORK EXPERIENCE</w:t>
       </w:r>
     </w:p>
@@ -573,12 +622,7 @@
     </w:p>
     <w:p>
       <w:pPr>
-        <w:pBdr>
-          <w:bottom w:val="single" w:sz="5" w:space="2" w:color="BFBFBF"/>
-        </w:pBdr>
-        <w:spacing w:before="140" w:after="60"/>
-      </w:pPr>
-      <w:r>
+        <w:spacing w:after="40"/>
         <w:rPr>
           <w:b/>
           <w:bCs/>
@@ -587,76 +631,92 @@
           <w:sz w:val="18"/>
           <w:szCs w:val="18"/>
         </w:rPr>
-        <w:t>TECHNICAL SKILLS</w:t>
+      </w:pPr>
+      <w:r>
+        <w:rPr>
+          <w:b/>
+          <w:bCs/>
+          <w:color w:val="3B6E71"/>
+          <w:spacing w:val="16"/>
+          <w:sz w:val="18"/>
+          <w:szCs w:val="18"/>
+        </w:rPr>
+        <w:t>Data Analysis:</w:t>
+      </w:r>
+      <w:r>
+        <w:rPr>
+          <w:b/>
+          <w:bCs/>
+          <w:color w:val="3B6E71"/>
+          <w:spacing w:val="16"/>
+          <w:sz w:val="18"/>
+          <w:szCs w:val="18"/>
+        </w:rPr>
+        <w:t xml:space="preserve"> SQL, Excel, Power BI/Tableau, Statistics, Dashboarding, Python, Pandas</w:t>
       </w:r>
     </w:p>
     <w:p>
       <w:pPr>
         <w:spacing w:after="40"/>
-      </w:pPr>
-      <w:r>
-        <w:rPr>
-          <w:b/>
-          <w:bCs/>
-          <w:color w:val="2B2B2B"/>
-          <w:sz w:val="16"/>
-          <w:szCs w:val="16"/>
-        </w:rPr>
-        <w:t xml:space="preserve">Web Development: </w:t>
-      </w:r>
-      <w:r>
-        <w:rPr>
-          <w:color w:val="2B2B2B"/>
-          <w:sz w:val="16"/>
-          <w:szCs w:val="16"/>
-        </w:rPr>
-        <w:t>JavaScript, React, Next.js, Tailwind CSS, HTML5/CSS3, JWT Auth</w:t>
+        <w:rPr>
+          <w:b/>
+          <w:bCs/>
+          <w:color w:val="2B2B2B"/>
+          <w:sz w:val="16"/>
+          <w:szCs w:val="16"/>
+        </w:rPr>
+      </w:pPr>
+      <w:r>
+        <w:rPr>
+          <w:b/>
+          <w:bCs/>
+          <w:color w:val="2B2B2B"/>
+          <w:sz w:val="16"/>
+          <w:szCs w:val="16"/>
+        </w:rPr>
+        <w:t>Web Development:</w:t>
+      </w:r>
+      <w:r>
+        <w:rPr>
+          <w:b/>
+          <w:bCs/>
+          <w:color w:val="2B2B2B"/>
+          <w:sz w:val="16"/>
+          <w:szCs w:val="16"/>
+        </w:rPr>
+        <w:t xml:space="preserve"> JavaScript, React, Next.js, Tailwind CSS, HTML5/CSS3, JWT Auth</w:t>
       </w:r>
     </w:p>
     <w:p>
       <w:pPr>
         <w:spacing w:after="40"/>
-      </w:pPr>
-      <w:r>
-        <w:rPr>
-          <w:b/>
-          <w:bCs/>
-          <w:color w:val="2B2B2B"/>
-          <w:sz w:val="16"/>
-          <w:szCs w:val="16"/>
-        </w:rPr>
-        <w:t xml:space="preserve">Backend &amp; Database: </w:t>
-      </w:r>
-      <w:r>
-        <w:rPr>
-          <w:color w:val="2B2B2B"/>
-          <w:sz w:val="16"/>
-          <w:szCs w:val="16"/>
-        </w:rPr>
-        <w:t>Golang, SQL Server, REST API Design</w:t>
-      </w:r>
-    </w:p>
-    <w:p>
-      <w:pPr>
-        <w:spacing w:after="40"/>
-      </w:pPr>
-      <w:r>
-        <w:rPr>
-          <w:b/>
-          <w:bCs/>
-          <w:color w:val="2B2B2B"/>
-          <w:sz w:val="16"/>
-          <w:szCs w:val="16"/>
-        </w:rPr>
-        <w:t xml:space="preserve">Data &amp; Automation: </w:t>
-      </w:r>
-      <w:r>
-        <w:rPr>
-          <w:color w:val="2B2B2B"/>
-          <w:sz w:val="16"/>
-          <w:szCs w:val="16"/>
-        </w:rPr>
-        <w:t>Python, Pandas</w:t>
+        <w:rPr>
+          <w:b/>
+          <w:bCs/>
+          <w:color w:val="2B2B2B"/>
+          <w:sz w:val="16"/>
+          <w:szCs w:val="16"/>
+        </w:rPr>
+      </w:pPr>
+      <w:r>
+        <w:rPr>
+          <w:b/>
+          <w:bCs/>
+          <w:color w:val="2B2B2B"/>
+          <w:sz w:val="16"/>
+          <w:szCs w:val="16"/>
+        </w:rPr>
+        <w:t>Backend &amp; Database:</w:t>
+      </w:r>
+      <w:r>
+        <w:rPr>
+          <w:b/>
+          <w:bCs/>
+          <w:color w:val="2B2B2B"/>
+          <w:sz w:val="16"/>
+          <w:szCs w:val="16"/>
+        </w:rPr>
+        <w:t xml:space="preserve"> Golang, SQL Server, REST API Design</w:t>
       </w:r>
     </w:p>
     <w:p>

</xml_diff>

<commit_message>
Update CV Nota POS project entry to GreenPos
</commit_message>
<xml_diff>
--- a/assets/cv/CV_Joni_Hermawan_English.docx
+++ b/assets/cv/CV_Joni_Hermawan_English.docx
@@ -202,34 +202,44 @@
     <w:p>
       <w:pPr>
         <w:spacing w:after="40"/>
-      </w:pPr>
-      <w:r>
-        <w:rPr>
-          <w:b/>
-          <w:bCs/>
-          <w:color w:val="2B2B2B"/>
-          <w:sz w:val="16"/>
-          <w:szCs w:val="16"/>
-        </w:rPr>
-        <w:t xml:space="preserve">Nota POS  </w:t>
-      </w:r>
-      <w:r>
-        <w:rPr>
+        <w:rPr>
+          <w:b/>
+          <w:bCs/>
+          <w:color w:val="2B2B2B"/>
+          <w:sz w:val="16"/>
+          <w:szCs w:val="16"/>
+        </w:rPr>
+      </w:pPr>
+      <w:r>
+        <w:rPr>
+          <w:b/>
+          <w:bCs/>
+          <w:color w:val="2B2B2B"/>
+          <w:sz w:val="16"/>
+          <w:szCs w:val="16"/>
+        </w:rPr>
+        <w:t xml:space="preserve">GreenPos  </w:t>
+      </w:r>
+      <w:r>
+        <w:rPr>
+          <w:b/>
+          <w:bCs/>
           <w:i/>
-          <w:iCs/>
-          <w:color w:val="3B6E71"/>
-          <w:sz w:val="15"/>
-          <w:szCs w:val="15"/>
-        </w:rPr>
-        <w:t xml:space="preserve">(Next.js, Golang, SQL Server)  —  </w:t>
-      </w:r>
-      <w:r>
-        <w:rPr>
-          <w:color w:val="2B2B2B"/>
-          <w:sz w:val="16"/>
-          <w:szCs w:val="16"/>
-        </w:rPr>
-        <w:t>Multi-role point-of-sale system (Cashier, PPIC, Finance, Admin) with QRIS &amp; EDC payment integration and ESC/POS thermal receipt printing. (2023–present)</w:t>
+          <w:color w:val="2B2B2B"/>
+          <w:sz w:val="16"/>
+          <w:szCs w:val="16"/>
+        </w:rPr>
+        <w:t>(React Native, Next.js, Golang)</w:t>
+      </w:r>
+      <w:r>
+        <w:rPr>
+          <w:b/>
+          <w:bCs/>
+          <w:color w:val="2B2B2B"/>
+          <w:sz w:val="16"/>
+          <w:szCs w:val="16"/>
+        </w:rPr>
+        <w:t xml:space="preserve">  —  A rebrand and continued evolution of Nota POS: a 4-role mobile cashier system (Cashier, PPIC, Finance, Admin), a separate web backoffice, QRIS &amp; EDC payment integration. (2023-present)</w:t>
       </w:r>
     </w:p>
     <w:p>

</xml_diff>